<commit_message>
Update docs for enterprise UI
Refresh illustrative UI screenshot and Word docs to reflect the new menu structure, toolbar, settings-based quality/language, and total progress.

Made-with: Cursor
</commit_message>
<xml_diff>
--- a/docs/word/User_Guide.docx
+++ b/docs/word/User_Guide.docx
@@ -46,17 +46,12 @@
     </w:p>
     <w:p>
       <w:r>
-        <w:t>Click “Add videos”, choose one or more files, then click “Start queue”.</w:t>
+        <w:t>Use File → Add videos… or click “Add videos”, choose one or more files, then click “Start queue”.</w:t>
       </w:r>
     </w:p>
     <w:p>
       <w:r>
-        <w:t>Use Quality: Draft for speed, Final for best accuracy.</w:t>
-      </w:r>
-    </w:p>
-    <w:p>
-      <w:r>
-        <w:t>Language hint: Auto is recommended for Hinglish; use Hindi/English hints for edge cases.</w:t>
+        <w:t>Quality and language defaults are configured under Settings.</w:t>
       </w:r>
     </w:p>
     <w:p>

</xml_diff>